<commit_message>
Descripción;  Me encargue de realizar otros cambios en la clase Futbolista para la validación y actualización de información como objeto y el de su selección correspondiente también implemente el método calcular fuerza para la clase Selección, faltaría que realizara las actualizaciones cada que agrego, elimino un jugador, remplazo un entrenador, o cambia de posición en el ranking de países.
</commit_message>
<xml_diff>
--- a/Documentacion/Documentacion Externa/Bitacora.docx
+++ b/Documentacion/Documentacion Externa/Bitacora.docx
@@ -70,15 +70,39 @@
         <w:t xml:space="preserve">Descripción: Me dedique a </w:t>
       </w:r>
       <w:r>
-        <w:t xml:space="preserve">crear un modulo que diera la capacidad al programa de reconstruir la información de cada objeto país, selección, entrenador, jugador utilizando la información guardada en los archivos de texto cada vez que </w:t>
-      </w:r>
-      <w:proofErr w:type="spellStart"/>
-      <w:r>
-        <w:t>el</w:t>
-      </w:r>
-      <w:proofErr w:type="spellEnd"/>
-      <w:r>
-        <w:t xml:space="preserve"> programa se ejecutara y un modelo que pueda guardar los objetos “país” y  “selección” cuando el programa estuviera activo actuando como una base de datos entre módulos.</w:t>
+        <w:t>crear un modulo que diera la capacidad al programa de reconstruir la información de cada objeto país, selección, entrenador, jugador utilizando la información guardada en los archivos de texto cada vez que el programa se ejecutara y un modelo que pueda guardar los objetos “país” y  “selección” cuando el programa estuviera activo actuando como una base de datos entre módulos.</w:t>
+      </w:r>
+    </w:p>
+    <w:p/>
+    <w:p>
+      <w:r>
+        <w:t>Fecha 17/06/2026</w:t>
+      </w:r>
+    </w:p>
+    <w:p>
+      <w:r>
+        <w:t>Descripción; me dedique a terminar algunas de los métodos sin terminar de la clase país y clase Selección, también aplique varios cambios para integrar el uso del modulo de Datos para obtener la información de los objetos y estructurar de manera más simple el código mediante pasos descriptivos para cada bloque.</w:t>
+      </w:r>
+    </w:p>
+    <w:p/>
+    <w:p/>
+    <w:p/>
+    <w:p/>
+    <w:p>
+      <w:r>
+        <w:lastRenderedPageBreak/>
+        <w:t>Fecha: 18/06/2026</w:t>
+      </w:r>
+    </w:p>
+    <w:p>
+      <w:r>
+        <w:t xml:space="preserve">Descripción;  Me encargue de realizar </w:t>
+      </w:r>
+      <w:r>
+        <w:t>otros cambios</w:t>
+      </w:r>
+      <w:r>
+        <w:t xml:space="preserve"> en la clase Futbolista para la validación y actualización de información como objeto y el de su selección correspondiente también implemente el método calcular fuerza para la clase Selección, faltaría que realizara las actualizaciones cada que agrego, elimino un jugador, remplazo un entrenador, o cambia de posición en el ranking de países.</w:t>
       </w:r>
     </w:p>
     <w:sectPr>
@@ -694,6 +718,7 @@
   <w:style w:type="character" w:default="1" w:styleId="Fuentedeprrafopredeter">
     <w:name w:val="Default Paragraph Font"/>
     <w:uiPriority w:val="1"/>
+    <w:semiHidden/>
     <w:unhideWhenUsed/>
   </w:style>
   <w:style w:type="table" w:default="1" w:styleId="Tablanormal">

</xml_diff>

<commit_message>
descripción; Realice algunos cambios para calcular la fuerza de equipo, específicamente en las validaciones indicando al programa la condición que debía cumplir la selección para poder calcular su fuerza, se elimino la posibilidad de guardarlo en el archivo de texto al considerar una forma más rápida de obtener el resultado con las condiciones apropiadas.
</commit_message>
<xml_diff>
--- a/Documentacion/Documentacion Externa/Bitacora.docx
+++ b/Documentacion/Documentacion Externa/Bitacora.docx
@@ -103,6 +103,17 @@
       </w:r>
       <w:r>
         <w:t xml:space="preserve"> en la clase Futbolista para la validación y actualización de información como objeto y el de su selección correspondiente también implemente el método calcular fuerza para la clase Selección, faltaría que realizara las actualizaciones cada que agrego, elimino un jugador, remplazo un entrenador, o cambia de posición en el ranking de países.</w:t>
+      </w:r>
+    </w:p>
+    <w:p/>
+    <w:p>
+      <w:r>
+        <w:t>Fecha: 21/06/2026</w:t>
+      </w:r>
+    </w:p>
+    <w:p>
+      <w:r>
+        <w:t>descripción; Realice algunos cambios para calcular la fuerza de equipo, específicamente en las validaciones indicando al programa la condición que debía cumplir la selección para poder calcular su fuerza, se elimino la posibilidad de guardarlo en el archivo de texto al considerar una forma más rápida de obtener el resultado con las condiciones apropiadas.</w:t>
       </w:r>
     </w:p>
     <w:sectPr>

</xml_diff>

<commit_message>
añadi los metodos a la clase partido, falta poco para terminarla
</commit_message>
<xml_diff>
--- a/Documentacion/Documentacion Externa/Bitacora.docx
+++ b/Documentacion/Documentacion Externa/Bitacora.docx
@@ -9,7 +9,6 @@
           <w:szCs w:val="56"/>
         </w:rPr>
       </w:pPr>
-      <w:proofErr w:type="spellStart"/>
       <w:r>
         <w:rPr>
           <w:sz w:val="56"/>
@@ -17,7 +16,6 @@
         </w:rPr>
         <w:t>Bitacora</w:t>
       </w:r>
-      <w:proofErr w:type="spellEnd"/>
     </w:p>
     <w:p>
       <w:pPr>
@@ -113,7 +111,48 @@
     </w:p>
     <w:p>
       <w:r>
-        <w:t>descripción; Realice algunos cambios para calcular la fuerza de equipo, específicamente en las validaciones indicando al programa la condición que debía cumplir la selección para poder calcular su fuerza, se elimino la posibilidad de guardarlo en el archivo de texto al considerar una forma más rápida de obtener el resultado con las condiciones apropiadas.</w:t>
+        <w:t>D</w:t>
+      </w:r>
+      <w:r>
+        <w:t>escripción; Realice algunos cambios para calcular la fuerza de equipo, específicamente en las validaciones indicando al programa la condición que debía cumplir la selección para poder calcular su fuerza, se elimino la posibilidad de guardarlo en el archivo de texto al considerar una forma más rápida de obtener el resultado con las condiciones apropiadas.</w:t>
+      </w:r>
+    </w:p>
+    <w:p/>
+    <w:p>
+      <w:r>
+        <w:t>Fecha: 22/06/2026</w:t>
+      </w:r>
+    </w:p>
+    <w:p>
+      <w:pPr>
+        <w:ind w:left="708" w:hanging="708"/>
+        <w:rPr>
+          <w:u w:val="single"/>
+        </w:rPr>
+      </w:pPr>
+      <w:r>
+        <w:t xml:space="preserve">Descripción; realice cambios en el nombre de dos módulos, también añadí un nuevo módulo que contendría la clase partido se completaron las clases de selección y Futbolista, específicamente lo que faltaban era el conteo de goles y penalizaciones adquiridas durante la competición, también </w:t>
+      </w:r>
+      <w:r>
+        <w:t>añadí</w:t>
+      </w:r>
+      <w:r>
+        <w:t xml:space="preserve"> nuevos </w:t>
+      </w:r>
+      <w:r>
+        <w:t xml:space="preserve">atributos </w:t>
+      </w:r>
+      <w:r>
+        <w:t xml:space="preserve">para </w:t>
+      </w:r>
+      <w:r>
+        <w:t xml:space="preserve">las </w:t>
+      </w:r>
+      <w:r>
+        <w:t>dos clases antes mencionada</w:t>
+      </w:r>
+      <w:r>
+        <w:t>s.</w:t>
       </w:r>
     </w:p>
     <w:sectPr>

</xml_diff>

<commit_message>
Descripción; me dedique a terminar los métodos de la clase partido, realice un par de cambios para que el método generar_ganador llamara a l método simular y dependiendo del resultado de la simulación obtenido llamaría al método mostrar resultado para mostrarlo, luego se devuelve a donde fue llamado y retorna un ganador o un empate(None), también me encargue de realizar varios cambios en los métodos constructores de las clases País, Selección, Persona, Futbolista y Entrenador con la finalidad de que las validaciones dentro de los métodos constructores cumplan verdaderamente su función. Me estaría faltando definir una fecha, generar una id único y gestionar el atributo de fases para la clase partido, también debería de encontrar la manera de poder guardarlo en su archivo de texto correspondiente
</commit_message>
<xml_diff>
--- a/Documentacion/Documentacion Externa/Bitacora.docx
+++ b/Documentacion/Documentacion Externa/Bitacora.docx
@@ -68,7 +68,13 @@
         <w:t xml:space="preserve">Descripción: Me dedique a </w:t>
       </w:r>
       <w:r>
-        <w:t>crear un modulo que diera la capacidad al programa de reconstruir la información de cada objeto país, selección, entrenador, jugador utilizando la información guardada en los archivos de texto cada vez que el programa se ejecutara y un modelo que pueda guardar los objetos “país” y  “selección” cuando el programa estuviera activo actuando como una base de datos entre módulos.</w:t>
+        <w:t xml:space="preserve">crear un </w:t>
+      </w:r>
+      <w:r>
+        <w:t>módulo</w:t>
+      </w:r>
+      <w:r>
+        <w:t xml:space="preserve"> que diera la capacidad al programa de reconstruir la información de cada objeto país, selección, entrenador, jugador utilizando la información guardada en los archivos de texto cada vez que el programa se ejecutara y un modelo que pueda guardar los objetos “país” y  “selección” cuando el programa estuviera activo actuando como una base de datos entre módulos.</w:t>
       </w:r>
     </w:p>
     <w:p/>
@@ -79,7 +85,13 @@
     </w:p>
     <w:p>
       <w:r>
-        <w:t>Descripción; me dedique a terminar algunas de los métodos sin terminar de la clase país y clase Selección, también aplique varios cambios para integrar el uso del modulo de Datos para obtener la información de los objetos y estructurar de manera más simple el código mediante pasos descriptivos para cada bloque.</w:t>
+        <w:t xml:space="preserve">Descripción; me dedique a terminar algunas de los métodos sin terminar de la clase país y clase Selección, también aplique varios cambios para integrar el uso del </w:t>
+      </w:r>
+      <w:r>
+        <w:t>módulo</w:t>
+      </w:r>
+      <w:r>
+        <w:t xml:space="preserve"> de Datos para obtener la información de los objetos y estructurar de manera más simple el código mediante pasos descriptivos para cada bloque.</w:t>
       </w:r>
     </w:p>
     <w:p/>
@@ -114,13 +126,76 @@
         <w:t>D</w:t>
       </w:r>
       <w:r>
-        <w:t>escripción; Realice algunos cambios para calcular la fuerza de equipo, específicamente en las validaciones indicando al programa la condición que debía cumplir la selección para poder calcular su fuerza, se elimino la posibilidad de guardarlo en el archivo de texto al considerar una forma más rápida de obtener el resultado con las condiciones apropiadas.</w:t>
+        <w:t xml:space="preserve">escripción; Realice algunos cambios para calcular la fuerza de equipo, específicamente en las validaciones indicando al programa la condición que debía cumplir la selección para poder calcular su fuerza, se </w:t>
+      </w:r>
+      <w:r>
+        <w:t>eliminó</w:t>
+      </w:r>
+      <w:r>
+        <w:t xml:space="preserve"> la posibilidad de guardarlo en el archivo de texto al considerar una forma más rápida de obtener el resultado con las condiciones apropiadas.</w:t>
       </w:r>
     </w:p>
     <w:p/>
     <w:p>
       <w:r>
         <w:t>Fecha: 22/06/2026</w:t>
+      </w:r>
+    </w:p>
+    <w:p>
+      <w:pPr>
+        <w:ind w:left="708" w:hanging="708"/>
+        <w:jc w:val="both"/>
+      </w:pPr>
+      <w:r>
+        <w:t>Descripción; realice cambios en el nombre de dos módulos, también añadí un nuevo</w:t>
+      </w:r>
+      <w:r>
+        <w:t xml:space="preserve"> </w:t>
+      </w:r>
+      <w:r>
+        <w:t xml:space="preserve">módulo que contendría la clase partido se completaron las clases de selección y Futbolista, específicamente lo que faltaban era el conteo de goles y penalizaciones adquiridas durante la competición, también </w:t>
+      </w:r>
+      <w:r>
+        <w:t>añadí</w:t>
+      </w:r>
+      <w:r>
+        <w:t xml:space="preserve"> nuevos </w:t>
+      </w:r>
+      <w:r>
+        <w:t xml:space="preserve">atributos </w:t>
+      </w:r>
+      <w:r>
+        <w:t xml:space="preserve">para </w:t>
+      </w:r>
+      <w:r>
+        <w:t xml:space="preserve">las </w:t>
+      </w:r>
+      <w:r>
+        <w:t>dos clases antes mencionada</w:t>
+      </w:r>
+      <w:r>
+        <w:t>s.</w:t>
+      </w:r>
+    </w:p>
+    <w:p>
+      <w:pPr>
+        <w:ind w:left="708" w:hanging="708"/>
+        <w:jc w:val="both"/>
+      </w:pPr>
+    </w:p>
+    <w:p>
+      <w:pPr>
+        <w:ind w:left="708" w:hanging="708"/>
+        <w:jc w:val="both"/>
+      </w:pPr>
+    </w:p>
+    <w:p>
+      <w:pPr>
+        <w:ind w:left="708" w:hanging="708"/>
+        <w:jc w:val="both"/>
+      </w:pPr>
+      <w:r>
+        <w:t>Fecha: 25/06/2026</w:t>
       </w:r>
     </w:p>
     <w:p>
@@ -131,28 +206,11 @@
         </w:rPr>
       </w:pPr>
       <w:r>
-        <w:t xml:space="preserve">Descripción; realice cambios en el nombre de dos módulos, también añadí un nuevo módulo que contendría la clase partido se completaron las clases de selección y Futbolista, específicamente lo que faltaban era el conteo de goles y penalizaciones adquiridas durante la competición, también </w:t>
-      </w:r>
-      <w:r>
-        <w:t>añadí</w:t>
-      </w:r>
-      <w:r>
-        <w:t xml:space="preserve"> nuevos </w:t>
-      </w:r>
-      <w:r>
-        <w:t xml:space="preserve">atributos </w:t>
-      </w:r>
-      <w:r>
-        <w:t xml:space="preserve">para </w:t>
-      </w:r>
-      <w:r>
-        <w:t xml:space="preserve">las </w:t>
-      </w:r>
-      <w:r>
-        <w:t>dos clases antes mencionada</w:t>
-      </w:r>
-      <w:r>
-        <w:t>s.</w:t>
+        <w:t xml:space="preserve">Descripción; me dedique a terminar los métodos de la clase partido, realice un par de cambios para que el método generar_ganador llamara a l método simular y dependiendo del resultado de la simulación obtenido llamaría al método mostrar resultado para mostrarlo, luego se devuelve a donde fue llamado y retorna un ganador o un empate(None), también me encargue de realizar varios cambios en los métodos constructores de las clases País, Selección, Persona, Futbolista y Entrenador con la finalidad de que las validaciones dentro de los métodos constructores cumplan verdaderamente su función. Me estaría faltando definir una fecha, generar una id único y gestionar el atributo </w:t>
+      </w:r>
+      <w:r>
+        <w:lastRenderedPageBreak/>
+        <w:t>de fases para la clase partido, también debería de encontrar la manera de poder guardarlo en su archivo de texto correspondiente</w:t>
       </w:r>
     </w:p>
     <w:sectPr>

</xml_diff>

<commit_message>
Descripción; Realice un par de cambios a la clase Partido, por ejemplo, añadí dos nuevos atributos que se encargarían de guardar la tanda de penales en caso de que suceda un empate y si desee consultar aquella información, también añadí un algoritmo que definiera una fecha “DD/MM/AA” especifico usando un rango de la librería ramdon y según la fase en la que se encuentre el objeto partido tendrá una u otra fecha de manera automática
</commit_message>
<xml_diff>
--- a/Documentacion/Documentacion Externa/Bitacora.docx
+++ b/Documentacion/Documentacion Externa/Bitacora.docx
@@ -251,6 +251,27 @@
       <w:proofErr w:type="spellEnd"/>
       <w:r>
         <w:t xml:space="preserve"> llamara a l método simular y dependiendo del resultado de la simulación obtenido llamaría al método mostrar resultado para mostrarlo, luego se devuelve a donde fue llamado y retorna un ganador o un empate(None), también me encargue de realizar varios cambios en los métodos constructores de las clases País, Selección, Persona, Futbolista y Entrenador con la finalidad de que las validaciones dentro de los métodos constructores cumplan verdaderamente su función. Me estaría faltando definir una fecha, generar una id único y gestionar el atributo de fases para la clase partido, también debería de encontrar la manera de poder guardarlo en su archivo de texto correspondiente</w:t>
+      </w:r>
+    </w:p>
+    <w:p>
+      <w:pPr>
+        <w:ind w:left="708" w:hanging="708"/>
+      </w:pPr>
+    </w:p>
+    <w:p>
+      <w:pPr>
+        <w:ind w:left="708" w:hanging="708"/>
+      </w:pPr>
+      <w:r>
+        <w:t>Fecha 26/06/2026</w:t>
+      </w:r>
+    </w:p>
+    <w:p>
+      <w:pPr>
+        <w:ind w:left="708" w:hanging="708"/>
+      </w:pPr>
+      <w:r>
+        <w:t>Descripción; Realice un par de cambios a la clase Partido, por ejemplo, añadí dos nuevos atributos que se encargarían de guardar la tanda de penales en caso de que suceda un empate y si desee consultar aquella información, también añadí un algoritmo que definiera una fecha “DD/MM/AA” especifico usando un rango de la librería ramdon y según la fase en la que se encuentre el objeto partido tendrá una u otra fecha de manera automática</w:t>
       </w:r>
     </w:p>
     <w:p/>

</xml_diff>

<commit_message>
Descripción; entre los trabajos realizados, he terminado la clase fases con sus atributos y métodos necesarios para su funcionamiento, realice unos cambios a la clase partido para que cada método funcionara independientemente y no que generar_ganador llamara a los demás métodos, también hice un par de cambios a estas dos clases al momento de iniciar el programa saltara ciertas validaciones o procesos del método, también añadí una nueva función en el módulo de ejecución para que creara todos los partidos y equipos a sus fases correspondientes desde fase de grupos hasta semifinales, añadí dos nuevas variables generales para la fase de grupos de grupos y las fases eliminatorias.
</commit_message>
<xml_diff>
--- a/Documentacion/Documentacion Externa/Bitacora.docx
+++ b/Documentacion/Documentacion Externa/Bitacora.docx
@@ -242,15 +242,10 @@
         <w:ind w:left="708" w:hanging="708"/>
       </w:pPr>
       <w:r>
-        <w:t xml:space="preserve">Descripción; me dedique a terminar los métodos de la clase partido, realice un par de cambios para que el método </w:t>
-      </w:r>
-      <w:proofErr w:type="spellStart"/>
-      <w:r>
-        <w:t>generar_ganador</w:t>
-      </w:r>
-      <w:proofErr w:type="spellEnd"/>
-      <w:r>
-        <w:t xml:space="preserve"> llamara a l método simular y dependiendo del resultado de la simulación obtenido llamaría al método mostrar resultado para mostrarlo, luego se devuelve a donde fue llamado y retorna un ganador o un empate(None), también me encargue de realizar varios cambios en los métodos constructores de las clases País, Selección, Persona, Futbolista y Entrenador con la finalidad de que las validaciones dentro de los métodos constructores cumplan verdaderamente su función. Me estaría faltando definir una fecha, generar una id único y gestionar el atributo de fases para la clase partido, también debería de encontrar la manera de poder guardarlo en su archivo de texto correspondiente</w:t>
+        <w:t>Descripción; me dedique a terminar los métodos de la clase partido, realice un par de cambios para que el método generar_ganador llamara a l método simular y dependiendo del resultado de la simulación obtenido llamaría al método mostrar resultado para mostrarlo, luego se devuelve a donde fue llamado y retorna un ganador o un empate(None), también me encargue de realizar varios cambios en los métodos constructores de las clases País, Selección, Persona, Futbolista y Entrenador con la finalidad de que las validaciones dentro de los métodos constructores cumplan verdaderamente su función. Me estaría faltando definir una fecha, generar una id único y gestionar el atributo de fases para la clase partido, también debería de encontrar la manera de poder guardarlo en su archivo de texto correspondiente</w:t>
+      </w:r>
+      <w:r>
+        <w:t>.</w:t>
       </w:r>
     </w:p>
     <w:p>
@@ -272,6 +267,66 @@
       </w:pPr>
       <w:r>
         <w:t>Descripción; Realice un par de cambios a la clase Partido, por ejemplo, añadí dos nuevos atributos que se encargarían de guardar la tanda de penales en caso de que suceda un empate y si desee consultar aquella información, también añadí un algoritmo que definiera una fecha “DD/MM/AA” especifico usando un rango de la librería ramdon y según la fase en la que se encuentre el objeto partido tendrá una u otra fecha de manera automática</w:t>
+      </w:r>
+      <w:r>
+        <w:t>.</w:t>
+      </w:r>
+      <w:r>
+        <w:tab/>
+      </w:r>
+    </w:p>
+    <w:p>
+      <w:pPr>
+        <w:ind w:left="708" w:hanging="708"/>
+      </w:pPr>
+    </w:p>
+    <w:p>
+      <w:pPr>
+        <w:ind w:left="708" w:hanging="708"/>
+      </w:pPr>
+      <w:r>
+        <w:t>Fecha 27/06/2026</w:t>
+      </w:r>
+    </w:p>
+    <w:p>
+      <w:pPr>
+        <w:ind w:left="708" w:hanging="708"/>
+        <w:rPr>
+          <w:u w:val="single"/>
+        </w:rPr>
+      </w:pPr>
+      <w:r>
+        <w:t>Descripción</w:t>
+      </w:r>
+      <w:r>
+        <w:t xml:space="preserve">; entre los trabajos realizados, he terminado la clase fases con sus atributos y métodos necesarios para su funcionamiento, realice unos cambios a la clase partido para que cada método funcionara independientemente y no que generar_ganador llamara a los demás métodos, también hice un par de cambios a estas dos clases al momento de iniciar el programa saltara ciertas validaciones o procesos del método, también </w:t>
+      </w:r>
+      <w:r>
+        <w:t>añadí</w:t>
+      </w:r>
+      <w:r>
+        <w:t xml:space="preserve"> una nueva </w:t>
+      </w:r>
+      <w:r>
+        <w:t>función</w:t>
+      </w:r>
+      <w:r>
+        <w:t xml:space="preserve"> en el </w:t>
+      </w:r>
+      <w:r>
+        <w:t>módulo</w:t>
+      </w:r>
+      <w:r>
+        <w:t xml:space="preserve"> de ejecución para que creara todos los partidos y equipos a sus fases correspondientes desde fase de grupos hasta semifinales</w:t>
+      </w:r>
+      <w:r>
+        <w:t xml:space="preserve">, </w:t>
+      </w:r>
+      <w:r>
+        <w:t>añadí</w:t>
+      </w:r>
+      <w:r>
+        <w:t xml:space="preserve"> dos nuevas variables generales para la fase de grupos de grupos y las fases eliminatorias</w:t>
       </w:r>
     </w:p>
     <w:p/>

</xml_diff>